<commit_message>
docs: update student info to Vi Trung Viet (23IT.B245), embed real screenshots and regenerate docx and pdf
</commit_message>
<xml_diff>
--- a/Bao_Cao_Mini_Project_1_VKU_Field_Survey.docx
+++ b/Bao_Cao_Mini_Project_1_VKU_Field_Survey.docx
@@ -130,7 +130,7 @@
                 <w:color w:val="0F172A"/>
                 <w:sz w:val="21"/>
               </w:rPr>
-              <w:t>Phan Trung Việt (Sinh viên thực hiện)</w:t>
+              <w:t>Vi Trung Việt (Sinh viên thực hiện)</w:t>
             </w:r>
           </w:p>
         </w:tc>
@@ -181,7 +181,7 @@
                 <w:color w:val="0F172A"/>
                 <w:sz w:val="21"/>
               </w:rPr>
-              <w:t>23ITB / Lớp Kỹ thuật phần mềm VKU</w:t>
+              <w:t>23IT.B245 / Lớp 23ITB (Kỹ thuật phần mềm VKU)</w:t>
             </w:r>
           </w:p>
         </w:tc>
@@ -1933,387 +1933,282 @@
           <w:rFonts w:ascii="Times New Roman" w:hAnsi="Times New Roman"/>
           <w:sz w:val="21"/>
         </w:rPr>
-        <w:t>Dưới đây là các vị trí khung chờ để dán ảnh chụp màn hình kiểm thử thực tế trên thiết bị di động / máy tính. Sinh viên chỉ cần dán ảnh chụp thật vào từng khung tương ứng trước khi xuất sang file PDF nộp bài:</w:t>
+        <w:t>Dưới đây là các hình ảnh chụp thực tế quá trình vận hành của ứng dụng VKU Field Survey trên môi trường Web PWA và Mobile Android:</w:t>
       </w:r>
     </w:p>
-    <w:tbl>
-      <w:tblPr>
-        <w:tblW w:type="auto" w:w="0"/>
-        <w:jc w:val="center"/>
-        <w:tblLook w:firstColumn="1" w:firstRow="1" w:lastColumn="0" w:lastRow="0" w:noHBand="0" w:noVBand="1" w:val="04A0"/>
-      </w:tblPr>
-      <w:tblGrid>
-        <w:gridCol w:w="9792"/>
-      </w:tblGrid>
-      <w:tr>
-        <w:tc>
-          <w:tcPr>
-            <w:tcW w:type="dxa" w:w="9792"/>
-            <w:shd w:fill="F8FAFC"/>
-            <w:tcMar>
-              <w:top w:w="200" w:type="dxa"/>
-              <w:bottom w:w="200" w:type="dxa"/>
-              <w:left w:w="240" w:type="dxa"/>
-              <w:right w:w="240" w:type="dxa"/>
-            </w:tcMar>
-            <w:tcBorders>
-              <w:top w:val="dashed" w:sz="8" w:space="0" w:color="0284C7"/>
-              <w:bottom w:val="dashed" w:sz="8" w:space="0" w:color="0284C7"/>
-              <w:left w:val="dashed" w:sz="8" w:space="0" w:color="0284C7"/>
-              <w:right w:val="dashed" w:sz="8" w:space="0" w:color="0284C7"/>
-            </w:tcBorders>
-          </w:tcPr>
-          <w:p>
-            <w:pPr>
-              <w:spacing w:before="160" w:after="80"/>
-              <w:jc w:val="center"/>
-            </w:pPr>
-            <w:r>
-              <w:rPr>
-                <w:rFonts w:ascii="Times New Roman" w:hAnsi="Times New Roman"/>
-                <w:b/>
-                <w:color w:val="0284C7"/>
-                <w:sz w:val="22"/>
-              </w:rPr>
-              <w:t>🖼️ [ CHÈN ẢNH TẠI ĐÂY: Giao diện Form Khảo Sát &amp; Phân Khu VKU (Desktop / Mobile) ]</w:t>
-            </w:r>
-          </w:p>
-          <w:p>
-            <w:pPr>
-              <w:spacing w:before="0" w:after="160"/>
-              <w:jc w:val="center"/>
-            </w:pPr>
-            <w:r>
-              <w:rPr>
-                <w:rFonts w:ascii="Times New Roman" w:hAnsi="Times New Roman"/>
-                <w:i/>
-                <w:color w:val="64748B"/>
-                <w:sz w:val="19"/>
-              </w:rPr>
-              <w:t>Mô tả: Chụp màn hình Bước 1: hiển thị 10 khối cơ sở vật chất VKU (Khu V, Khu K...), chip chọn nhanh Tầng (T.1-T.5) và gợi ý tên phòng chuẩn (V.A502, K.A207...).</w:t>
-            </w:r>
-          </w:p>
-        </w:tc>
-      </w:tr>
-    </w:tbl>
     <w:p>
       <w:pPr>
-        <w:spacing w:before="80" w:after="240"/>
+        <w:spacing w:before="160" w:after="80"/>
+        <w:jc w:val="center"/>
+      </w:pPr>
+      <w:r>
+        <w:drawing>
+          <wp:inline xmlns:a="http://schemas.openxmlformats.org/drawingml/2006/main" xmlns:pic="http://schemas.openxmlformats.org/drawingml/2006/picture">
+            <wp:extent cx="5120640" cy="3182227"/>
+            <wp:docPr id="1" name="Picture 1"/>
+            <wp:cNvGraphicFramePr>
+              <a:graphicFrameLocks noChangeAspect="1"/>
+            </wp:cNvGraphicFramePr>
+            <a:graphic>
+              <a:graphicData uri="http://schemas.openxmlformats.org/drawingml/2006/picture">
+                <pic:pic>
+                  <pic:nvPicPr>
+                    <pic:cNvPr id="0" name="step1_main_form.png"/>
+                    <pic:cNvPicPr/>
+                  </pic:nvPicPr>
+                  <pic:blipFill>
+                    <a:blip r:embed="rId9"/>
+                    <a:stretch>
+                      <a:fillRect/>
+                    </a:stretch>
+                  </pic:blipFill>
+                  <pic:spPr>
+                    <a:xfrm>
+                      <a:off x="0" y="0"/>
+                      <a:ext cx="5120640" cy="3182227"/>
+                    </a:xfrm>
+                    <a:prstGeom prst="rect"/>
+                  </pic:spPr>
+                </pic:pic>
+              </a:graphicData>
+            </a:graphic>
+          </wp:inline>
+        </w:drawing>
+      </w:r>
+    </w:p>
+    <w:p>
+      <w:pPr>
+        <w:spacing w:before="40" w:after="240"/>
         <w:jc w:val="center"/>
       </w:pPr>
       <w:r>
         <w:rPr>
           <w:rFonts w:ascii="Times New Roman" w:hAnsi="Times New Roman"/>
-          <w:b/>
           <w:i/>
-          <w:color w:val="334155"/>
-          <w:sz w:val="20"/>
+          <w:color w:val="475569"/>
+          <w:sz w:val="19"/>
         </w:rPr>
-        <w:t>Hình: Giao diện Form Khảo Sát &amp; Phân Khu VKU (Desktop / Mobile)</w:t>
+        <w:t>Hình: Form Khảo Sát Bước 1 — 10 Phân Khu Cơ Sở Vật Chất &amp; Tọa Độ GPS VKU — Giao diện Cyber-Glass Inspector Cockpit hiển thị 10 phân khu VKU, chip chọn nhanh tầng (T.1-T.5) và phòng học chuẩn thời khóa biểu.</w:t>
       </w:r>
     </w:p>
-    <w:tbl>
-      <w:tblPr>
-        <w:tblW w:type="auto" w:w="0"/>
-        <w:jc w:val="center"/>
-        <w:tblLook w:firstColumn="1" w:firstRow="1" w:lastColumn="0" w:lastRow="0" w:noHBand="0" w:noVBand="1" w:val="04A0"/>
-      </w:tblPr>
-      <w:tblGrid>
-        <w:gridCol w:w="9792"/>
-      </w:tblGrid>
-      <w:tr>
-        <w:tc>
-          <w:tcPr>
-            <w:tcW w:type="dxa" w:w="9792"/>
-            <w:shd w:fill="F8FAFC"/>
-            <w:tcMar>
-              <w:top w:w="200" w:type="dxa"/>
-              <w:bottom w:w="200" w:type="dxa"/>
-              <w:left w:w="240" w:type="dxa"/>
-              <w:right w:w="240" w:type="dxa"/>
-            </w:tcMar>
-            <w:tcBorders>
-              <w:top w:val="dashed" w:sz="8" w:space="0" w:color="0284C7"/>
-              <w:bottom w:val="dashed" w:sz="8" w:space="0" w:color="0284C7"/>
-              <w:left w:val="dashed" w:sz="8" w:space="0" w:color="0284C7"/>
-              <w:right w:val="dashed" w:sz="8" w:space="0" w:color="0284C7"/>
-            </w:tcBorders>
-          </w:tcPr>
-          <w:p>
-            <w:pPr>
-              <w:spacing w:before="160" w:after="80"/>
-              <w:jc w:val="center"/>
-            </w:pPr>
-            <w:r>
-              <w:rPr>
-                <w:rFonts w:ascii="Times New Roman" w:hAnsi="Times New Roman"/>
-                <w:b/>
-                <w:color w:val="0284C7"/>
-                <w:sz w:val="22"/>
-              </w:rPr>
-              <w:t>🖼️ [ CHÈN ẢNH TẠI ĐÂY: Kiểm thử Ngắt kết nối mạng (Offline Test) &amp; Phục hồi Bản nháp ]</w:t>
-            </w:r>
-          </w:p>
-          <w:p>
-            <w:pPr>
-              <w:spacing w:before="0" w:after="160"/>
-              <w:jc w:val="center"/>
-            </w:pPr>
-            <w:r>
-              <w:rPr>
-                <w:rFonts w:ascii="Times New Roman" w:hAnsi="Times New Roman"/>
-                <w:i/>
-                <w:color w:val="64748B"/>
-                <w:sz w:val="19"/>
-              </w:rPr>
-              <w:t>Mô tả: Bật chế độ Offline trên trình duyệt (Network Tab -&gt; Offline) hoặc ngắt WiFi: Thanh trạng thái chuyển sang màu đỏ 'Mất kết nối mạng', form vẫn nhập bình thường và dữ liệu bản nháp được lưu an toàn trong IndexedDB.</w:t>
-            </w:r>
-          </w:p>
-        </w:tc>
-      </w:tr>
-    </w:tbl>
     <w:p>
       <w:pPr>
-        <w:spacing w:before="80" w:after="240"/>
+        <w:spacing w:before="160" w:after="80"/>
+        <w:jc w:val="center"/>
+      </w:pPr>
+      <w:r>
+        <w:drawing>
+          <wp:inline xmlns:a="http://schemas.openxmlformats.org/drawingml/2006/main" xmlns:pic="http://schemas.openxmlformats.org/drawingml/2006/picture">
+            <wp:extent cx="5120640" cy="3184236"/>
+            <wp:docPr id="2" name="Picture 2"/>
+            <wp:cNvGraphicFramePr>
+              <a:graphicFrameLocks noChangeAspect="1"/>
+            </wp:cNvGraphicFramePr>
+            <a:graphic>
+              <a:graphicData uri="http://schemas.openxmlformats.org/drawingml/2006/picture">
+                <pic:pic>
+                  <pic:nvPicPr>
+                    <pic:cNvPr id="0" name="step2_devices_defects.png"/>
+                    <pic:cNvPicPr/>
+                  </pic:nvPicPr>
+                  <pic:blipFill>
+                    <a:blip r:embed="rId10"/>
+                    <a:stretch>
+                      <a:fillRect/>
+                    </a:stretch>
+                  </pic:blipFill>
+                  <pic:spPr>
+                    <a:xfrm>
+                      <a:off x="0" y="0"/>
+                      <a:ext cx="5120640" cy="3184236"/>
+                    </a:xfrm>
+                    <a:prstGeom prst="rect"/>
+                  </pic:spPr>
+                </pic:pic>
+              </a:graphicData>
+            </a:graphic>
+          </wp:inline>
+        </w:drawing>
+      </w:r>
+    </w:p>
+    <w:p>
+      <w:pPr>
+        <w:spacing w:before="40" w:after="240"/>
         <w:jc w:val="center"/>
       </w:pPr>
       <w:r>
         <w:rPr>
           <w:rFonts w:ascii="Times New Roman" w:hAnsi="Times New Roman"/>
-          <w:b/>
           <w:i/>
-          <w:color w:val="334155"/>
-          <w:sz w:val="20"/>
+          <w:color w:val="475569"/>
+          <w:sz w:val="19"/>
         </w:rPr>
-        <w:t>Hình: Kiểm thử Ngắt kết nối mạng (Offline Test) &amp; Phục hồi Bản nháp</w:t>
+        <w:t>Hình: Form Khảo Sát Bước 2 — Danh Mục Trang Thiết Bị &amp; Tag Khiếm Khuyết Nhanh — Lựa chọn thiết bị khảo sát kèm danh mục tag lỗi phổ biến 1 chạm có gắn LED màu trạng thái trực quan.</w:t>
       </w:r>
     </w:p>
-    <w:tbl>
-      <w:tblPr>
-        <w:tblW w:type="auto" w:w="0"/>
-        <w:jc w:val="center"/>
-        <w:tblLook w:firstColumn="1" w:firstRow="1" w:lastColumn="0" w:lastRow="0" w:noHBand="0" w:noVBand="1" w:val="04A0"/>
-      </w:tblPr>
-      <w:tblGrid>
-        <w:gridCol w:w="9792"/>
-      </w:tblGrid>
-      <w:tr>
-        <w:tc>
-          <w:tcPr>
-            <w:tcW w:type="dxa" w:w="9792"/>
-            <w:shd w:fill="F8FAFC"/>
-            <w:tcMar>
-              <w:top w:w="200" w:type="dxa"/>
-              <w:bottom w:w="200" w:type="dxa"/>
-              <w:left w:w="240" w:type="dxa"/>
-              <w:right w:w="240" w:type="dxa"/>
-            </w:tcMar>
-            <w:tcBorders>
-              <w:top w:val="dashed" w:sz="8" w:space="0" w:color="0284C7"/>
-              <w:bottom w:val="dashed" w:sz="8" w:space="0" w:color="0284C7"/>
-              <w:left w:val="dashed" w:sz="8" w:space="0" w:color="0284C7"/>
-              <w:right w:val="dashed" w:sz="8" w:space="0" w:color="0284C7"/>
-            </w:tcBorders>
-          </w:tcPr>
-          <w:p>
-            <w:pPr>
-              <w:spacing w:before="160" w:after="80"/>
-              <w:jc w:val="center"/>
-            </w:pPr>
-            <w:r>
-              <w:rPr>
-                <w:rFonts w:ascii="Times New Roman" w:hAnsi="Times New Roman"/>
-                <w:b/>
-                <w:color w:val="0284C7"/>
-                <w:sz w:val="22"/>
-              </w:rPr>
-              <w:t>🖼️ [ CHÈN ẢNH TẠI ĐÂY: Chụp ảnh Hiện trường Khiếm khuyết &amp; Tự động Nén dung lượng ]</w:t>
-            </w:r>
-          </w:p>
-          <w:p>
-            <w:pPr>
-              <w:spacing w:before="0" w:after="160"/>
-              <w:jc w:val="center"/>
-            </w:pPr>
-            <w:r>
-              <w:rPr>
-                <w:rFonts w:ascii="Times New Roman" w:hAnsi="Times New Roman"/>
-                <w:i/>
-                <w:color w:val="64748B"/>
-                <w:sz w:val="19"/>
-              </w:rPr>
-              <w:t>Mô tả: Chụp màn hình Bước 2 &amp; 3: Ảnh chụp hiện trường thiết bị hỏng (máy chiếu, điều hòa, công tắc điện) được nén gọn kèm thông tin dung lượng (&lt; 250KB) và gắn tọa độ GPS.</w:t>
-            </w:r>
-          </w:p>
-        </w:tc>
-      </w:tr>
-    </w:tbl>
     <w:p>
       <w:pPr>
-        <w:spacing w:before="80" w:after="240"/>
+        <w:spacing w:before="160" w:after="80"/>
+        <w:jc w:val="center"/>
+      </w:pPr>
+      <w:r>
+        <w:drawing>
+          <wp:inline xmlns:a="http://schemas.openxmlformats.org/drawingml/2006/main" xmlns:pic="http://schemas.openxmlformats.org/drawingml/2006/picture">
+            <wp:extent cx="5120640" cy="3184236"/>
+            <wp:docPr id="3" name="Picture 3"/>
+            <wp:cNvGraphicFramePr>
+              <a:graphicFrameLocks noChangeAspect="1"/>
+            </wp:cNvGraphicFramePr>
+            <a:graphic>
+              <a:graphicData uri="http://schemas.openxmlformats.org/drawingml/2006/picture">
+                <pic:pic>
+                  <pic:nvPicPr>
+                    <pic:cNvPr id="0" name="step3_camera_priority.png"/>
+                    <pic:cNvPicPr/>
+                  </pic:nvPicPr>
+                  <pic:blipFill>
+                    <a:blip r:embed="rId11"/>
+                    <a:stretch>
+                      <a:fillRect/>
+                    </a:stretch>
+                  </pic:blipFill>
+                  <pic:spPr>
+                    <a:xfrm>
+                      <a:off x="0" y="0"/>
+                      <a:ext cx="5120640" cy="3184236"/>
+                    </a:xfrm>
+                    <a:prstGeom prst="rect"/>
+                  </pic:spPr>
+                </pic:pic>
+              </a:graphicData>
+            </a:graphic>
+          </wp:inline>
+        </w:drawing>
+      </w:r>
+    </w:p>
+    <w:p>
+      <w:pPr>
+        <w:spacing w:before="40" w:after="240"/>
         <w:jc w:val="center"/>
       </w:pPr>
       <w:r>
         <w:rPr>
           <w:rFonts w:ascii="Times New Roman" w:hAnsi="Times New Roman"/>
-          <w:b/>
           <w:i/>
-          <w:color w:val="334155"/>
-          <w:sz w:val="20"/>
+          <w:color w:val="475569"/>
+          <w:sz w:val="19"/>
         </w:rPr>
-        <w:t>Hình: Chụp ảnh Hiện trường Khiếm khuyết &amp; Tự động Nén dung lượng</w:t>
+        <w:t>Hình: Form Khảo Sát Bước 3 — Đánh Giá Sao, Mức Độ Ưu Tiên &amp; Camera Nén Ảnh — Hệ thống chấm điểm 1-5 sao phát quang, phân loại ưu tiên (Khẩn cấp/Cần xử lý/Bình thường) và khung camera nén Canvas &lt; 250KB.</w:t>
       </w:r>
     </w:p>
-    <w:tbl>
-      <w:tblPr>
-        <w:tblW w:type="auto" w:w="0"/>
-        <w:jc w:val="center"/>
-        <w:tblLook w:firstColumn="1" w:firstRow="1" w:lastColumn="0" w:lastRow="0" w:noHBand="0" w:noVBand="1" w:val="04A0"/>
-      </w:tblPr>
-      <w:tblGrid>
-        <w:gridCol w:w="9792"/>
-      </w:tblGrid>
-      <w:tr>
-        <w:tc>
-          <w:tcPr>
-            <w:tcW w:type="dxa" w:w="9792"/>
-            <w:shd w:fill="F8FAFC"/>
-            <w:tcMar>
-              <w:top w:w="200" w:type="dxa"/>
-              <w:bottom w:w="200" w:type="dxa"/>
-              <w:left w:w="240" w:type="dxa"/>
-              <w:right w:w="240" w:type="dxa"/>
-            </w:tcMar>
-            <w:tcBorders>
-              <w:top w:val="dashed" w:sz="8" w:space="0" w:color="0284C7"/>
-              <w:bottom w:val="dashed" w:sz="8" w:space="0" w:color="0284C7"/>
-              <w:left w:val="dashed" w:sz="8" w:space="0" w:color="0284C7"/>
-              <w:right w:val="dashed" w:sz="8" w:space="0" w:color="0284C7"/>
-            </w:tcBorders>
-          </w:tcPr>
-          <w:p>
-            <w:pPr>
-              <w:spacing w:before="160" w:after="80"/>
-              <w:jc w:val="center"/>
-            </w:pPr>
-            <w:r>
-              <w:rPr>
-                <w:rFonts w:ascii="Times New Roman" w:hAnsi="Times New Roman"/>
-                <w:b/>
-                <w:color w:val="0284C7"/>
-                <w:sz w:val="22"/>
-              </w:rPr>
-              <w:t>🖼️ [ CHÈN ẢNH TẠI ĐÂY: Tự động Đồng bộ Ngoại tuyến lên Cloudflare (Online Sync) ]</w:t>
-            </w:r>
-          </w:p>
-          <w:p>
-            <w:pPr>
-              <w:spacing w:before="0" w:after="160"/>
-              <w:jc w:val="center"/>
-            </w:pPr>
-            <w:r>
-              <w:rPr>
-                <w:rFonts w:ascii="Times New Roman" w:hAnsi="Times New Roman"/>
-                <w:i/>
-                <w:color w:val="64748B"/>
-                <w:sz w:val="19"/>
-              </w:rPr>
-              <w:t>Mô tả: Kết nối lại Internet: Hàng đợi hiển thị thông báo 'Đồng bộ ngầm thành công', phiếu khảo sát được gửi thẳng lên Cloudflare Pages Functions và cấp Transaction ID.</w:t>
-            </w:r>
-          </w:p>
-        </w:tc>
-      </w:tr>
-    </w:tbl>
     <w:p>
       <w:pPr>
-        <w:spacing w:before="80" w:after="240"/>
+        <w:spacing w:before="160" w:after="80"/>
+        <w:jc w:val="center"/>
+      </w:pPr>
+      <w:r>
+        <w:drawing>
+          <wp:inline xmlns:a="http://schemas.openxmlformats.org/drawingml/2006/main" xmlns:pic="http://schemas.openxmlformats.org/drawingml/2006/picture">
+            <wp:extent cx="5120640" cy="9916159"/>
+            <wp:docPr id="4" name="Picture 4"/>
+            <wp:cNvGraphicFramePr>
+              <a:graphicFrameLocks noChangeAspect="1"/>
+            </wp:cNvGraphicFramePr>
+            <a:graphic>
+              <a:graphicData uri="http://schemas.openxmlformats.org/drawingml/2006/picture">
+                <pic:pic>
+                  <pic:nvPicPr>
+                    <pic:cNvPr id="0" name="history_audit_dashboard.png"/>
+                    <pic:cNvPicPr/>
+                  </pic:nvPicPr>
+                  <pic:blipFill>
+                    <a:blip r:embed="rId12"/>
+                    <a:stretch>
+                      <a:fillRect/>
+                    </a:stretch>
+                  </pic:blipFill>
+                  <pic:spPr>
+                    <a:xfrm>
+                      <a:off x="0" y="0"/>
+                      <a:ext cx="5120640" cy="9916159"/>
+                    </a:xfrm>
+                    <a:prstGeom prst="rect"/>
+                  </pic:spPr>
+                </pic:pic>
+              </a:graphicData>
+            </a:graphic>
+          </wp:inline>
+        </w:drawing>
+      </w:r>
+    </w:p>
+    <w:p>
+      <w:pPr>
+        <w:spacing w:before="40" w:after="240"/>
         <w:jc w:val="center"/>
       </w:pPr>
       <w:r>
         <w:rPr>
           <w:rFonts w:ascii="Times New Roman" w:hAnsi="Times New Roman"/>
-          <w:b/>
           <w:i/>
-          <w:color w:val="334155"/>
-          <w:sz w:val="20"/>
+          <w:color w:val="475569"/>
+          <w:sz w:val="19"/>
         </w:rPr>
-        <w:t>Hình: Tự động Đồng bộ Ngoại tuyến lên Cloudflare (Online Sync)</w:t>
+        <w:t>Hình: Bảng Điều Khiển Lịch Sử Khảo Sát (Audit Dashboard) &amp; Thống Kê KPI — Ribbon 4 chỉ số KPI thời gian thực, bộ lọc đa năng 10 phân khu, trạng thái PENDING_SYNC/SYNCED và các nút xuất CSV/PDF.</w:t>
       </w:r>
     </w:p>
-    <w:tbl>
-      <w:tblPr>
-        <w:tblW w:type="auto" w:w="0"/>
-        <w:jc w:val="center"/>
-        <w:tblLook w:firstColumn="1" w:firstRow="1" w:lastColumn="0" w:lastRow="0" w:noHBand="0" w:noVBand="1" w:val="04A0"/>
-      </w:tblPr>
-      <w:tblGrid>
-        <w:gridCol w:w="9792"/>
-      </w:tblGrid>
-      <w:tr>
-        <w:tc>
-          <w:tcPr>
-            <w:tcW w:type="dxa" w:w="9792"/>
-            <w:shd w:fill="F8FAFC"/>
-            <w:tcMar>
-              <w:top w:w="200" w:type="dxa"/>
-              <w:bottom w:w="200" w:type="dxa"/>
-              <w:left w:w="240" w:type="dxa"/>
-              <w:right w:w="240" w:type="dxa"/>
-            </w:tcMar>
-            <w:tcBorders>
-              <w:top w:val="dashed" w:sz="8" w:space="0" w:color="0284C7"/>
-              <w:bottom w:val="dashed" w:sz="8" w:space="0" w:color="0284C7"/>
-              <w:left w:val="dashed" w:sz="8" w:space="0" w:color="0284C7"/>
-              <w:right w:val="dashed" w:sz="8" w:space="0" w:color="0284C7"/>
-            </w:tcBorders>
-          </w:tcPr>
-          <w:p>
-            <w:pPr>
-              <w:spacing w:before="160" w:after="80"/>
-              <w:jc w:val="center"/>
-            </w:pPr>
-            <w:r>
-              <w:rPr>
-                <w:rFonts w:ascii="Times New Roman" w:hAnsi="Times New Roman"/>
-                <w:b/>
-                <w:color w:val="0284C7"/>
-                <w:sz w:val="22"/>
-              </w:rPr>
-              <w:t>🖼️ [ CHÈN ẢNH TẠI ĐÂY: Trang Quản lý Lịch sử, Lọc đa tiêu chí &amp; Xuất Báo cáo CSV/PDF ]</w:t>
-            </w:r>
-          </w:p>
-          <w:p>
-            <w:pPr>
-              <w:spacing w:before="0" w:after="160"/>
-              <w:jc w:val="center"/>
-            </w:pPr>
-            <w:r>
-              <w:rPr>
-                <w:rFonts w:ascii="Times New Roman" w:hAnsi="Times New Roman"/>
-                <w:i/>
-                <w:color w:val="64748B"/>
-                <w:sz w:val="19"/>
-              </w:rPr>
-              <w:t>Mô tả: Chụp màn hình tab 'Lịch sử': Hiển thị Ribbon thống kê tỷ lệ đồng bộ, bộ lọc theo 10 phân khu, các nút chức năng Sửa/Xóa/Gửi lại và nút Xuất Excel (CSV).</w:t>
-            </w:r>
-          </w:p>
-        </w:tc>
-      </w:tr>
-    </w:tbl>
     <w:p>
       <w:pPr>
-        <w:spacing w:before="80" w:after="240"/>
+        <w:spacing w:before="160" w:after="80"/>
+        <w:jc w:val="center"/>
+      </w:pPr>
+      <w:r>
+        <w:drawing>
+          <wp:inline xmlns:a="http://schemas.openxmlformats.org/drawingml/2006/main" xmlns:pic="http://schemas.openxmlformats.org/drawingml/2006/picture">
+            <wp:extent cx="5120640" cy="9947741"/>
+            <wp:docPr id="5" name="Picture 5"/>
+            <wp:cNvGraphicFramePr>
+              <a:graphicFrameLocks noChangeAspect="1"/>
+            </wp:cNvGraphicFramePr>
+            <a:graphic>
+              <a:graphicData uri="http://schemas.openxmlformats.org/drawingml/2006/picture">
+                <pic:pic>
+                  <pic:nvPicPr>
+                    <pic:cNvPr id="0" name="mobile_responsive_view.png"/>
+                    <pic:cNvPicPr/>
+                  </pic:nvPicPr>
+                  <pic:blipFill>
+                    <a:blip r:embed="rId13"/>
+                    <a:stretch>
+                      <a:fillRect/>
+                    </a:stretch>
+                  </pic:blipFill>
+                  <pic:spPr>
+                    <a:xfrm>
+                      <a:off x="0" y="0"/>
+                      <a:ext cx="5120640" cy="9947741"/>
+                    </a:xfrm>
+                    <a:prstGeom prst="rect"/>
+                  </pic:spPr>
+                </pic:pic>
+              </a:graphicData>
+            </a:graphic>
+          </wp:inline>
+        </w:drawing>
+      </w:r>
+    </w:p>
+    <w:p>
+      <w:pPr>
+        <w:spacing w:before="40" w:after="240"/>
         <w:jc w:val="center"/>
       </w:pPr>
       <w:r>
         <w:rPr>
           <w:rFonts w:ascii="Times New Roman" w:hAnsi="Times New Roman"/>
-          <w:b/>
           <w:i/>
-          <w:color w:val="334155"/>
-          <w:sz w:val="20"/>
+          <w:color w:val="475569"/>
+          <w:sz w:val="19"/>
         </w:rPr>
-        <w:t>Hình: Trang Quản lý Lịch sử, Lọc đa tiêu chí &amp; Xuất Báo cáo CSV/PDF</w:t>
+        <w:t>Hình: Giao Diện Mobile Responsive Trên Thiết Bị Di Động (Android PWA / APK) — Tối ưu hóa bố cục buồng lái công nghệ cao trên màn hình điện thoại di động, thanh điều hướng nổi và thao tác 1 tay thuận tiện.</w:t>
       </w:r>
     </w:p>
     <w:p>

</xml_diff>